<commit_message>
Assignment 3 report update
</commit_message>
<xml_diff>
--- a/Assignment#03/report/Assignment3_TechnicalReport.docx
+++ b/Assignment#03/report/Assignment3_TechnicalReport.docx
@@ -827,7 +827,7 @@
           <w:b/>
           <w:bCs/>
         </w:rPr>
-        <w:t xml:space="preserve">299 unique surface forms</w:t>
+        <w:t xml:space="preserve">298 unique surface forms</w:t>
       </w:r>
       <w:r>
         <w:t xml:space="preserve"> </w:t>
@@ -1104,7 +1104,7 @@
         <w:t xml:space="preserve"> </w:t>
       </w:r>
       <w:r>
-        <w:t xml:space="preserve">uses 532,661 labelled rows; we note that the dataset contains no</w:t>
+        <w:t xml:space="preserve">uses 533,429 labelled rows; we note that the dataset contains no</w:t>
       </w:r>
       <w:r>
         <w:t xml:space="preserve"> </w:t>
@@ -1468,13 +1468,13 @@
           <w:b/>
           <w:bCs/>
         </w:rPr>
-        <w:t xml:space="preserve">Emotion distribution (n = 532,661):</w:t>
-      </w:r>
-      <w:r>
-        <w:t xml:space="preserve"> </w:t>
-      </w:r>
-      <w:r>
-        <w:t xml:space="preserve">Joy 459,033 (86.2 %); Sad 50,375 (9.5 %); Disgust 17,071 (3.2 %); Angry 2,798 (0.5 %); Fear 1,837 (0.3 %); Surprise 1,547 (0.3 %).</w:t>
+        <w:t xml:space="preserve">Emotion distribution (n = 533,429):</w:t>
+      </w:r>
+      <w:r>
+        <w:t xml:space="preserve"> </w:t>
+      </w:r>
+      <w:r>
+        <w:t xml:space="preserve">Joy 459,728 (86.2 %); Sad 50,417 (9.5 %); Disgust 17,083 (3.2 %); Angry 2,802 (0.5 %); Fear 1,847 (0.3 %); Surprise 1,552 (0.3 %).</w:t>
       </w:r>
     </w:p>
     <w:p>
@@ -1496,7 +1496,7 @@
         <w:t xml:space="preserve"> </w:t>
       </w:r>
       <w:r>
-        <w:t xml:space="preserve">Positive 459,033 (86.2 %), Negative 72,081 (13.5 %), Neutral 1,547 (0.3 %).</w:t>
+        <w:t xml:space="preserve">Positive 459,728 (86.2 %), Negative 72,149 (13.5 %), Neutral 1,552 (0.3 %).</w:t>
       </w:r>
     </w:p>
     <w:p>
@@ -1518,7 +1518,7 @@
         <w:t xml:space="preserve"> </w:t>
       </w:r>
       <w:r>
-        <w:t xml:space="preserve">≈ 297× for the emotion task and ≈ 297× for the sentiment task. We address this with inverse-frequency class weights in every model’s loss (Section 6).</w:t>
+        <w:t xml:space="preserve">≈ 296× for the emotion task and ≈ 296× for the sentiment task. We address this with inverse-frequency class weights in every model’s loss (Section 6).</w:t>
       </w:r>
     </w:p>
     <w:p>
@@ -1574,7 +1574,7 @@
         <w:t xml:space="preserve"> </w:t>
       </w:r>
       <w:r>
-        <w:t xml:space="preserve">33 tokens, which guides our</w:t>
+        <w:t xml:space="preserve">36 tokens, which guides our</w:t>
       </w:r>
       <w:r>
         <w:t xml:space="preserve"> </w:t>
@@ -5908,7 +5908,7 @@
         <w:t xml:space="preserve">macro-F1 is mBERT at 0.2703</w:t>
       </w:r>
       <w:r>
-        <w:t xml:space="preserve">, a 1.6-point absolute gain over XLM-R (0.2535) and Urdu-RoBERTa (0.2539), and a 2-point gain over Text-CNN (0.2499). The macro-F1 ceiling on the 6-class task is much lower than on the 3-class task because of the 297× class imbalance and the small absolute count of</w:t>
+        <w:t xml:space="preserve">, a 1.7-point absolute gain over XLM-R (0.2535) and Urdu-RoBERTa (0.2539), and a 2-point gain over Text-CNN (0.2499). The macro-F1 ceiling on the 6-class task is much lower than on the 3-class task because of the 296× class imbalance and the small absolute count of</w:t>
       </w:r>
       <w:r>
         <w:t xml:space="preserve"> </w:t>
@@ -6394,7 +6394,7 @@
           <w:i/>
           <w:iCs/>
         </w:rPr>
-        <w:t xml:space="preserve">نہیں</w:t>
+        <w:t xml:space="preserve">nahin</w:t>
       </w:r>
       <w:r>
         <w:t xml:space="preserve">,</w:t>
@@ -6407,7 +6407,7 @@
           <w:i/>
           <w:iCs/>
         </w:rPr>
-        <w:t xml:space="preserve">مت</w:t>
+        <w:t xml:space="preserve">mat</w:t>
       </w:r>
       <w:r>
         <w:t xml:space="preserve">,</w:t>
@@ -6420,7 +6420,7 @@
           <w:i/>
           <w:iCs/>
         </w:rPr>
-        <w:t xml:space="preserve">کبھی نہ</w:t>
+        <w:t xml:space="preserve">kabhi na</w:t>
       </w:r>
       <w:r>
         <w:t xml:space="preserve"> </w:t>
@@ -6436,7 +6436,7 @@
           <w:i/>
           <w:iCs/>
         </w:rPr>
-        <w:t xml:space="preserve">“خوشی نہیں ملی”</w:t>
+        <w:t xml:space="preserve">“khushi nahin mili”</w:t>
       </w:r>
       <w:r>
         <w:t xml:space="preserve"> </w:t>
@@ -7329,7 +7329,7 @@
         <w:t xml:space="preserve"> </w:t>
       </w:r>
       <w:r>
-        <w:t xml:space="preserve">On sentiment, Urdu-RoBERTa beats Text-CNN by 0.004 macro-F1 — a difference within noise. On emotion, mBERT’s 0.016 lead over Text-CNN is real but small. The pretrained fastText Urdu vectors (used by CNN and BiLSTM) carry most of the language-specific lift; contextual subword embeddings add a modest residual.</w:t>
+        <w:t xml:space="preserve">On sentiment, Urdu-RoBERTa beats Text-CNN by 0.004 macro-F1 — a difference within noise. On emotion, mBERT’s 0.020 lead over Text-CNN is real but small. The pretrained fastText Urdu vectors (used by CNN and BiLSTM) carry most of the language-specific lift; contextual subword embeddings add a modest residual.</w:t>
       </w:r>
     </w:p>
     <w:p>
@@ -7519,7 +7519,7 @@
         <w:t xml:space="preserve">mBERT the best 6-class emotion macro-F1 of 0.2703</w:t>
       </w:r>
       <w:r>
-        <w:t xml:space="preserve">. The CNN and BiLSTM baselines come within 0.005 / 0.020 macro-F1 of the best transformer on each task, respectively — i.e. once a strong Urdu fastText embedding is available, the contextual-subword advantage on this corpus is modest. The Linear SVM achieves the highest</w:t>
+        <w:t xml:space="preserve">. The CNN and BiLSTM baselines come within 0.004 / 0.028 macro-F1 of the best transformer on each task, respectively — i.e. once a strong Urdu fastText embedding is available, the contextual-subword advantage on this corpus is modest. The Linear SVM achieves the highest</w:t>
       </w:r>
       <w:r>
         <w:t xml:space="preserve"> </w:t>

</xml_diff>